<commit_message>
Update final submission documentation
Updated README and final user guide to reference the deployed branch and final assessment tag assignment-3-final-v4.
</commit_message>
<xml_diff>
--- a/docs/LifeBudget_Micro_User_Guide_FinalSubmission.docx
+++ b/docs/LifeBudget_Micro_User_Guide_FinalSubmission.docx
@@ -368,7 +368,7 @@
     <w:p>
       <w:pPr/>
       <w:r>
-        <w:t>The hosted Streamlit app is deployed from the deploy-lifebudget-demo branch. The final assessment tag assignment-3-final should point to the same deployed commit, so the marker can use the online app while also inspecting the exact code snapshot submitted for assessment.</w:t>
+        <w:t>The hosted Streamlit app is deployed from the deploy-lifebudget-demo branch. The final assessment tag assignment-3-final-v4 should point to the same deployed commit, so the marker can use the online app while also inspecting the exact code snapshot submitted for assessment.</w:t>
       </w:r>
     </w:p>
     <w:tbl>
@@ -475,7 +475,7 @@
           </w:tcPr>
           <w:p>
             <w:r>
-              <w:t>assignment-3-final</w:t>
+              <w:t>assignment-3-final-v4</w:t>
             </w:r>
           </w:p>
         </w:tc>
@@ -513,7 +513,7 @@
                 <w:rFonts w:ascii="Consolas" w:hAnsi="Consolas"/>
                 <w:sz w:val="17"/>
               </w:rPr>
-              <w:t>assignment-3-final</w:t>
+              <w:t>assignment-3-final-v4</w:t>
             </w:r>
           </w:p>
         </w:tc>

</xml_diff>

<commit_message>
Fix Streamlit warning in Step 5 technical overrides
Avoid passing explicit widget defaults to keyed technical override widgets after session_state sync.
This removes the hosted Streamlit warning without changing Strategy Engine logic.
</commit_message>
<xml_diff>
--- a/docs/LifeBudget_Micro_User_Guide_FinalSubmission.docx
+++ b/docs/LifeBudget_Micro_User_Guide_FinalSubmission.docx
@@ -208,6 +208,32 @@
     </w:p>
     <w:p>
       <w:pPr>
+        <w:pStyle w:val="Heading2"/>
+      </w:pPr>
+      <w:r>
+        <w:t>1.1 Intended Users</w:t>
+      </w:r>
+    </w:p>
+    <w:p>
+      <w:pPr/>
+      <w:r>
+        <w:t>LifeBudget Micro is designed for students, early-career users, and individual learners who want to understand how personal budgeting, saving capacity, historical investment testing, and long-term scenario planning can be connected in one educational workflow.</w:t>
+      </w:r>
+    </w:p>
+    <w:p>
+      <w:pPr/>
+      <w:r>
+        <w:t>The system is not designed for real financial advice, regulated suitability assessment, or production investment planning.</w:t>
+      </w:r>
+    </w:p>
+    <w:p>
+      <w:pPr/>
+      <w:r>
+        <w:t>It is also intended for assessors and technical reviewers who need to verify a working end-to-end software prototype: what input is provided, what action the system performs, what output is produced, and which limitations affect interpretation.</w:t>
+      </w:r>
+    </w:p>
+    <w:p>
+      <w:pPr>
         <w:pStyle w:val="Heading1"/>
       </w:pPr>
       <w:r>
@@ -368,7 +394,7 @@
     <w:p>
       <w:pPr/>
       <w:r>
-        <w:t>The hosted Streamlit app is deployed from the deploy-lifebudget-demo branch. The final assessment tag assignment-3-final-v4 should point to the same deployed commit, so the marker can use the online app while also inspecting the exact code snapshot submitted for assessment.</w:t>
+        <w:t>The hosted Streamlit app is deployed from the deploy-lifbudget-demo branch. The final assessment tag assignment-3-final should point to the same deployed commit, so the marker can use the online app while also inspecting the exact code snapshot submitted for assessment.</w:t>
       </w:r>
     </w:p>
     <w:tbl>
@@ -453,7 +479,7 @@
           </w:tcPr>
           <w:p>
             <w:r>
-              <w:t>deploy-lifebudget-demo</w:t>
+              <w:t>deploy-lifbudget-demo</w:t>
             </w:r>
           </w:p>
         </w:tc>
@@ -475,7 +501,7 @@
           </w:tcPr>
           <w:p>
             <w:r>
-              <w:t>assignment-3-final-v4</w:t>
+              <w:t>assignment-3-final</w:t>
             </w:r>
           </w:p>
         </w:tc>
@@ -513,7 +539,7 @@
                 <w:rFonts w:ascii="Consolas" w:hAnsi="Consolas"/>
                 <w:sz w:val="17"/>
               </w:rPr>
-              <w:t>assignment-3-final-v4</w:t>
+              <w:t>assignment-3-final</w:t>
             </w:r>
           </w:p>
         </w:tc>
@@ -815,6 +841,58 @@
     <w:p>
       <w:r>
         <w:t>This flow demonstrates the main idea of the project: a user can move from personal finance inputs to investment strategy testing and then to long-term educational scenario comparison.</w:t>
+      </w:r>
+    </w:p>
+    <w:p>
+      <w:pPr>
+        <w:pStyle w:val="Heading2"/>
+      </w:pPr>
+      <w:r>
+        <w:t>5.1 Assessment Evidence Path</w:t>
+      </w:r>
+    </w:p>
+    <w:p>
+      <w:pPr/>
+      <w:r>
+        <w:t>For assessment, the most important demonstration is the working end-to-end path rather than every optional diagnostic. The recommended evidence path is:</w:t>
+      </w:r>
+    </w:p>
+    <w:p>
+      <w:pPr>
+        <w:pStyle w:val="ListBullet"/>
+      </w:pPr>
+      <w:r>
+        <w:t>Input: enter or keep sample weekly finance values and a savings target.</w:t>
+      </w:r>
+    </w:p>
+    <w:p>
+      <w:pPr>
+        <w:pStyle w:val="ListBullet"/>
+      </w:pPr>
+      <w:r>
+        <w:t>Action: prepare the investment universe, run the Strategy Engine, and generate a long-term scenario.</w:t>
+      </w:r>
+    </w:p>
+    <w:p>
+      <w:pPr>
+        <w:pStyle w:val="ListBullet"/>
+      </w:pPr>
+      <w:r>
+        <w:t>Output/result: review the budget feasibility output, historical strategy metrics, benchmark context, projection chart, and final report.</w:t>
+      </w:r>
+    </w:p>
+    <w:p>
+      <w:pPr>
+        <w:pStyle w:val="ListBullet"/>
+      </w:pPr>
+      <w:r>
+        <w:t>Limitations: explain that the results are educational backtests, proxies, and scenarios rather than financial advice, forecasts, or guarantees.</w:t>
+      </w:r>
+    </w:p>
+    <w:p>
+      <w:pPr/>
+      <w:r>
+        <w:t>This mirrors the expected build-phase demonstration: the marker can see the system running, follow the input-action-output chain, and understand the main limitations.</w:t>
       </w:r>
     </w:p>
     <w:p>

</xml_diff>